<commit_message>
Completa portada del informe y quita la presentacion
</commit_message>
<xml_diff>
--- a/Informe_Tecnico_Vittorio_Coffee.docx
+++ b/Informe_Tecnico_Vittorio_Coffee.docx
@@ -49,7 +49,23 @@
         <w:jc w:val="center"/>
       </w:pPr>
       <w:r>
-        <w:t xml:space="preserve">[ Nombres de los integrantes del grupo ]</w:t>
+        <w:t xml:space="preserve">Danilo Palavecino</w:t>
+      </w:r>
+    </w:p>
+    <w:p>
+      <w:pPr>
+        <w:jc w:val="center"/>
+      </w:pPr>
+      <w:r>
+        <w:t xml:space="preserve">Juan de la Barra</w:t>
+      </w:r>
+    </w:p>
+    <w:p>
+      <w:pPr>
+        <w:jc w:val="center"/>
+      </w:pPr>
+      <w:r>
+        <w:t xml:space="preserve">Thalya Estefany Araneda Rivera</w:t>
       </w:r>
     </w:p>
     <w:p>
@@ -70,7 +86,7 @@
         <w:jc w:val="center"/>
       </w:pPr>
       <w:r>
-        <w:t xml:space="preserve">[ Carrera ]</w:t>
+        <w:t xml:space="preserve">Técnico en Informática</w:t>
       </w:r>
     </w:p>
     <w:p>
@@ -86,7 +102,7 @@
         <w:jc w:val="center"/>
       </w:pPr>
       <w:r>
-        <w:t xml:space="preserve">Profesor(a): [ Completar ]</w:t>
+        <w:t xml:space="preserve">Profesor: Alejandro Sebastián Sepúlveda Montero</w:t>
       </w:r>
     </w:p>
     <w:p>

</xml_diff>